<commit_message>
Catalog: stop over-collapsing; keep vintages + show vintage as identifier
The previous collapse keyed on barcode alone, which wrongly hid real rows: wine
vintages (same barcode, different vintage, different price) and placeholder/garbage
UPCs that the price files reuse across many unrelated products (e.g. 80480986353
on 44 products, all-9s/all-1s fillers). It even hid "-196 SB/LE/PC/GF 3X8" because
it shares a barcode with "-196 CRUSH VAR 3X8".

Now we only collapse rows identical on distributor + barcode + name + size +
vintage (effectively none in current data), so nothing real is hidden. Vintage is
selected and shown as a tag in the catalog, and the "Multiple distributors" tag
only fires for a genuine shared product (no single distributor reuses the barcode),
not for placeholder UPCs.

Co-Authored-By: Claude Opus 4.7 (1M context) <noreply@anthropic.com>
</commit_message>
<xml_diff>
--- a/docs/CELR_Video_Guide_Script.docx
+++ b/docs/CELR_Video_Guide_Script.docx
@@ -847,7 +847,7 @@
         <w:pStyle w:val="ListNumber"/>
       </w:pPr>
       <w:r>
-        <w:t>PRODUCT: image, name, barcode. A blue 'Multiple distributors' tag means the same barcode is carried by several wholesalers; the rarer red 'duplicate' tag means one distributor reused a barcode for different products. A green 'In combo' tag means it is in a bundle (click it to open the bundle in a popup).</w:t>
+        <w:t>PRODUCT: image, name, barcode. A blue 'Multiple distributors' tag means the same product is carried by several wholesalers; for wine, a 'Vintage' tag shows the year (one barcode can cover several vintages, each priced separately). A green 'In combo' tag means it is in a bundle (click it to open the bundle in a popup).</w:t>
       </w:r>
     </w:p>
     <w:p>
@@ -888,7 +888,7 @@
         <w:rPr>
           <w:i/>
         </w:rPr>
-        <w:t>“Each row reads left to right. First the product - its image, name, and barcode. A blue Multiple distributors tag means the same product is carried by more than one wholesaler, so you can compare and buy from whoever is cheaper; a green In combo tag means it is part of a bundle you can open in a popup. Then the list Case and Bottle price, how many tiers it has, the best saving, and - the number that really matters - the Effective price, what you pay after the best discount and rebate. ROI and GP percent show your return and margin.”</w:t>
+        <w:t>“Each row reads left to right. First the product - its image, name, and barcode. A blue Multiple distributors tag means the same product is carried by more than one wholesaler, so you can compare and buy from whoever is cheaper; for wine a Vintage tag shows the year, since one barcode can cover several vintages and each is priced separately; a green In combo tag means it is part of a bundle you can open in a popup. Then the list Case and Bottle price, how many tiers it has, the best saving, and - the number that really matters - the Effective price, what you pay after the best discount and rebate. ROI and GP percent show your return and margin.”</w:t>
       </w:r>
     </w:p>
     <w:p>

</xml_diff>